<commit_message>
add third MC lecture
</commit_message>
<xml_diff>
--- a/_site/syllabus-BEE4850-SP26.docx
+++ b/_site/syllabus-BEE4850-SP26.docx
@@ -473,17 +473,16 @@
         <w:tblStyle w:val="Table"/>
         <w:tblLook w:firstRow="0" w:lastRow="0" w:firstColumn="0" w:lastColumn="0" w:noHBand="0" w:noVBand="0" w:val="0000"/>
         <w:tblBorders>
+          <w:top w:val="single" w:sz="4" w:space="0" w:color="00A047"/>
           <w:left w:val="single" w:sz="24" w:space="0" w:color="00A047"/>
+          <w:bottom w:val="single" w:sz="4" w:space="0" w:color="00A047"/>
           <w:right w:val="single" w:sz="4" w:space="0" w:color="00A047"/>
-          <w:top w:val="single" w:sz="4" w:space="0" w:color="00A047"/>
-          <w:bottom w:val="single" w:sz="4" w:space="0" w:color="00A047"/>
         </w:tblBorders>
         <w:tblCellMar>
           <w:left w:w="144" w:type="dxa"/>
           <w:right w:w="144" w:type="dxa"/>
         </w:tblCellMar>
-        <w:tblInd w:w="164" w:type="dxa"/>
-        <w:tblW w:type="pct" w:w="100%"/>
+        <w:tblLook w:firstRow="0" w:lastRow="0" w:firstColumn="0" w:lastColumn="0" w:noHBand="0" w:noVBand="0" w:val="0000"/>
       </w:tblPr>
       <w:tr>
         <w:trPr>
@@ -581,6 +580,7 @@
               <w:t xml:space="preserve">If your programming or statistics skills are a little rusty, don’t worry! We will review concepts and build skills as needed.</w:t>
             </w:r>
           </w:p>
+          <w:p/>
         </w:tc>
       </w:tr>
     </w:tbl>
@@ -1148,17 +1148,16 @@
         <w:tblStyle w:val="Table"/>
         <w:tblLook w:firstRow="0" w:lastRow="0" w:firstColumn="0" w:lastColumn="0" w:noHBand="0" w:noVBand="0" w:val="0000"/>
         <w:tblBorders>
+          <w:top w:val="single" w:sz="4" w:space="0" w:color="CC1914"/>
           <w:left w:val="single" w:sz="24" w:space="0" w:color="CC1914"/>
+          <w:bottom w:val="single" w:sz="4" w:space="0" w:color="CC1914"/>
           <w:right w:val="single" w:sz="4" w:space="0" w:color="CC1914"/>
-          <w:top w:val="single" w:sz="4" w:space="0" w:color="CC1914"/>
-          <w:bottom w:val="single" w:sz="4" w:space="0" w:color="CC1914"/>
         </w:tblBorders>
         <w:tblCellMar>
           <w:left w:w="144" w:type="dxa"/>
           <w:right w:w="144" w:type="dxa"/>
         </w:tblCellMar>
-        <w:tblInd w:w="164" w:type="dxa"/>
-        <w:tblW w:type="pct" w:w="100%"/>
+        <w:tblLook w:firstRow="0" w:lastRow="0" w:firstColumn="0" w:lastColumn="0" w:noHBand="0" w:noVBand="0" w:val="0000"/>
       </w:tblPr>
       <w:tr>
         <w:trPr>
@@ -1256,6 +1255,7 @@
               <w:t xml:space="preserve">We all make mistakes in our communications with one another, both when speaking and listening. Be mindful of how spoken or written language might be misunderstood, and be aware that, for a variety of reasons, how others perceive your words and actions may not be exactly how you intended them. At the same time, it is also essential that we be respectful and interpret each other’s comments and actions in good faith.</w:t>
             </w:r>
           </w:p>
+          <w:p/>
         </w:tc>
       </w:tr>
     </w:tbl>
@@ -1347,17 +1347,16 @@
         <w:tblStyle w:val="Table"/>
         <w:tblLook w:firstRow="0" w:lastRow="0" w:firstColumn="0" w:lastColumn="0" w:noHBand="0" w:noVBand="0" w:val="0000"/>
         <w:tblBorders>
+          <w:top w:val="single" w:sz="4" w:space="0" w:color="CC1914"/>
           <w:left w:val="single" w:sz="24" w:space="0" w:color="CC1914"/>
+          <w:bottom w:val="single" w:sz="4" w:space="0" w:color="CC1914"/>
           <w:right w:val="single" w:sz="4" w:space="0" w:color="CC1914"/>
-          <w:top w:val="single" w:sz="4" w:space="0" w:color="CC1914"/>
-          <w:bottom w:val="single" w:sz="4" w:space="0" w:color="CC1914"/>
         </w:tblBorders>
         <w:tblCellMar>
           <w:left w:w="144" w:type="dxa"/>
           <w:right w:w="144" w:type="dxa"/>
         </w:tblCellMar>
-        <w:tblInd w:w="164" w:type="dxa"/>
-        <w:tblW w:type="pct" w:w="100%"/>
+        <w:tblLook w:firstRow="0" w:lastRow="0" w:firstColumn="0" w:lastColumn="0" w:noHBand="0" w:noVBand="0" w:val="0000"/>
       </w:tblPr>
       <w:tr>
         <w:trPr>
@@ -1500,6 +1499,7 @@
               <w:t xml:space="preserve">If you see unanswered questions and you have some insight, please answer! This class will work best when we all work together as a community.</w:t>
             </w:r>
           </w:p>
+          <w:p/>
         </w:tc>
       </w:tr>
     </w:tbl>
@@ -1540,17 +1540,16 @@
         <w:tblStyle w:val="Table"/>
         <w:tblLook w:firstRow="0" w:lastRow="0" w:firstColumn="0" w:lastColumn="0" w:noHBand="0" w:noVBand="0" w:val="0000"/>
         <w:tblBorders>
+          <w:top w:val="single" w:sz="4" w:space="0" w:color="CC1914"/>
           <w:left w:val="single" w:sz="24" w:space="0" w:color="CC1914"/>
+          <w:bottom w:val="single" w:sz="4" w:space="0" w:color="CC1914"/>
           <w:right w:val="single" w:sz="4" w:space="0" w:color="CC1914"/>
-          <w:top w:val="single" w:sz="4" w:space="0" w:color="CC1914"/>
-          <w:bottom w:val="single" w:sz="4" w:space="0" w:color="CC1914"/>
         </w:tblBorders>
         <w:tblCellMar>
           <w:left w:w="144" w:type="dxa"/>
           <w:right w:w="144" w:type="dxa"/>
         </w:tblCellMar>
-        <w:tblInd w:w="164" w:type="dxa"/>
-        <w:tblW w:type="pct" w:w="100%"/>
+        <w:tblLook w:firstRow="0" w:lastRow="0" w:firstColumn="0" w:lastColumn="0" w:noHBand="0" w:noVBand="0" w:val="0000"/>
       </w:tblPr>
       <w:tr>
         <w:trPr>
@@ -1648,6 +1647,7 @@
               <w:t xml:space="preserve">I am not a trained counselor, but I am here to support you in whatever capacity we can. You should never feel that you need to push yourself past your limits to complete any assignment for this class or any other. If we need to make modifications to the course or assignment schedule, you can certainly reach out to me, and all relevant discussions will be kept strictly confidential.</w:t>
             </w:r>
           </w:p>
+          <w:p/>
         </w:tc>
       </w:tr>
     </w:tbl>
@@ -1705,17 +1705,16 @@
         <w:tblStyle w:val="Table"/>
         <w:tblLook w:firstRow="0" w:lastRow="0" w:firstColumn="0" w:lastColumn="0" w:noHBand="0" w:noVBand="0" w:val="0000"/>
         <w:tblBorders>
+          <w:top w:val="single" w:sz="4" w:space="0" w:color="CC1914"/>
           <w:left w:val="single" w:sz="24" w:space="0" w:color="CC1914"/>
+          <w:bottom w:val="single" w:sz="4" w:space="0" w:color="CC1914"/>
           <w:right w:val="single" w:sz="4" w:space="0" w:color="CC1914"/>
-          <w:top w:val="single" w:sz="4" w:space="0" w:color="CC1914"/>
-          <w:bottom w:val="single" w:sz="4" w:space="0" w:color="CC1914"/>
         </w:tblBorders>
         <w:tblCellMar>
           <w:left w:w="144" w:type="dxa"/>
           <w:right w:w="144" w:type="dxa"/>
         </w:tblCellMar>
-        <w:tblInd w:w="164" w:type="dxa"/>
-        <w:tblW w:type="pct" w:w="100%"/>
+        <w:tblLook w:firstRow="0" w:lastRow="0" w:firstColumn="0" w:lastColumn="0" w:noHBand="0" w:noVBand="0" w:val="0000"/>
       </w:tblPr>
       <w:tr>
         <w:trPr>
@@ -1813,6 +1812,7 @@
               <w:t xml:space="preserve">Please stay home if you’re feeling sick! This is beneficial for both for your own recovery and the health and safety of your classmates. We will also make any necessary arrangements for you to stay on top of the class material and if whatever is going on will negatively impact your grade, for example by causing you to be unable to submit an assignment on time.</w:t>
             </w:r>
           </w:p>
+          <w:p/>
         </w:tc>
       </w:tr>
     </w:tbl>
@@ -1850,17 +1850,16 @@
         <w:tblStyle w:val="Table"/>
         <w:tblLook w:firstRow="0" w:lastRow="0" w:firstColumn="0" w:lastColumn="0" w:noHBand="0" w:noVBand="0" w:val="0000"/>
         <w:tblBorders>
+          <w:top w:val="single" w:sz="4" w:space="0" w:color="CC1914"/>
           <w:left w:val="single" w:sz="24" w:space="0" w:color="CC1914"/>
+          <w:bottom w:val="single" w:sz="4" w:space="0" w:color="CC1914"/>
           <w:right w:val="single" w:sz="4" w:space="0" w:color="CC1914"/>
-          <w:top w:val="single" w:sz="4" w:space="0" w:color="CC1914"/>
-          <w:bottom w:val="single" w:sz="4" w:space="0" w:color="CC1914"/>
         </w:tblBorders>
         <w:tblCellMar>
           <w:left w:w="144" w:type="dxa"/>
           <w:right w:w="144" w:type="dxa"/>
         </w:tblCellMar>
-        <w:tblInd w:w="164" w:type="dxa"/>
-        <w:tblW w:type="pct" w:w="100%"/>
+        <w:tblLook w:firstRow="0" w:lastRow="0" w:firstColumn="0" w:lastColumn="0" w:noHBand="0" w:noVBand="0" w:val="0000"/>
       </w:tblPr>
       <w:tr>
         <w:trPr>
@@ -1965,6 +1964,7 @@
               <w:t xml:space="preserve">: Don’t cheat, copy, or plagiarize!</w:t>
             </w:r>
           </w:p>
+          <w:p/>
         </w:tc>
       </w:tr>
     </w:tbl>
@@ -2049,17 +2049,16 @@
         <w:tblStyle w:val="Table"/>
         <w:tblLook w:firstRow="0" w:lastRow="0" w:firstColumn="0" w:lastColumn="0" w:noHBand="0" w:noVBand="0" w:val="0000"/>
         <w:tblBorders>
+          <w:top w:val="single" w:sz="4" w:space="0" w:color="00A047"/>
           <w:left w:val="single" w:sz="24" w:space="0" w:color="00A047"/>
+          <w:bottom w:val="single" w:sz="4" w:space="0" w:color="00A047"/>
           <w:right w:val="single" w:sz="4" w:space="0" w:color="00A047"/>
-          <w:top w:val="single" w:sz="4" w:space="0" w:color="00A047"/>
-          <w:bottom w:val="single" w:sz="4" w:space="0" w:color="00A047"/>
         </w:tblBorders>
         <w:tblCellMar>
           <w:left w:w="144" w:type="dxa"/>
           <w:right w:w="144" w:type="dxa"/>
         </w:tblCellMar>
-        <w:tblInd w:w="164" w:type="dxa"/>
-        <w:tblW w:type="pct" w:w="100%"/>
+        <w:tblLook w:firstRow="0" w:lastRow="0" w:firstColumn="0" w:lastColumn="0" w:noHBand="0" w:noVBand="0" w:val="0000"/>
       </w:tblPr>
       <w:tr>
         <w:trPr>
@@ -2186,6 +2185,7 @@
               <w:t xml:space="preserve">.</w:t>
             </w:r>
           </w:p>
+          <w:p/>
         </w:tc>
       </w:tr>
     </w:tbl>
@@ -2273,17 +2273,16 @@
         <w:tblStyle w:val="Table"/>
         <w:tblLook w:firstRow="0" w:lastRow="0" w:firstColumn="0" w:lastColumn="0" w:noHBand="0" w:noVBand="0" w:val="0000"/>
         <w:tblBorders>
+          <w:top w:val="single" w:sz="4" w:space="0" w:color="EB9113"/>
           <w:left w:val="single" w:sz="24" w:space="0" w:color="EB9113"/>
+          <w:bottom w:val="single" w:sz="4" w:space="0" w:color="EB9113"/>
           <w:right w:val="single" w:sz="4" w:space="0" w:color="EB9113"/>
-          <w:top w:val="single" w:sz="4" w:space="0" w:color="EB9113"/>
-          <w:bottom w:val="single" w:sz="4" w:space="0" w:color="EB9113"/>
         </w:tblBorders>
         <w:tblCellMar>
           <w:left w:w="144" w:type="dxa"/>
           <w:right w:w="144" w:type="dxa"/>
         </w:tblCellMar>
-        <w:tblInd w:w="164" w:type="dxa"/>
-        <w:tblW w:type="pct" w:w="100%"/>
+        <w:tblLook w:firstRow="0" w:lastRow="0" w:firstColumn="0" w:lastColumn="0" w:noHBand="0" w:noVBand="0" w:val="0000"/>
       </w:tblPr>
       <w:tr>
         <w:trPr>
@@ -2392,6 +2391,7 @@
               <w:t xml:space="preserve">This is fundamentally different from working with your classmates, who are also trying out the problems for the first time.</w:t>
             </w:r>
           </w:p>
+          <w:p/>
         </w:tc>
       </w:tr>
     </w:tbl>
@@ -2711,17 +2711,16 @@
         <w:tblStyle w:val="Table"/>
         <w:tblLook w:firstRow="0" w:lastRow="0" w:firstColumn="0" w:lastColumn="0" w:noHBand="0" w:noVBand="0" w:val="0000"/>
         <w:tblBorders>
+          <w:top w:val="single" w:sz="4" w:space="0" w:color="00A047"/>
           <w:left w:val="single" w:sz="24" w:space="0" w:color="00A047"/>
+          <w:bottom w:val="single" w:sz="4" w:space="0" w:color="00A047"/>
           <w:right w:val="single" w:sz="4" w:space="0" w:color="00A047"/>
-          <w:top w:val="single" w:sz="4" w:space="0" w:color="00A047"/>
-          <w:bottom w:val="single" w:sz="4" w:space="0" w:color="00A047"/>
         </w:tblBorders>
         <w:tblCellMar>
           <w:left w:w="144" w:type="dxa"/>
           <w:right w:w="144" w:type="dxa"/>
         </w:tblCellMar>
-        <w:tblInd w:w="164" w:type="dxa"/>
-        <w:tblW w:type="pct" w:w="100%"/>
+        <w:tblLook w:firstRow="0" w:lastRow="0" w:firstColumn="0" w:lastColumn="0" w:noHBand="0" w:noVBand="0" w:val="0000"/>
       </w:tblPr>
       <w:tr>
         <w:trPr>
@@ -2868,6 +2867,7 @@
               <w:t xml:space="preserve">if you have a question about a homework due on Thursday and send a request on the immediately prior Wednesday; schedules for course staff may already be full). We recommend starting your homework promptly so you can take advantage of office hours or make an appointment over a longer period.</w:t>
             </w:r>
           </w:p>
+          <w:p/>
         </w:tc>
       </w:tr>
     </w:tbl>
@@ -4012,17 +4012,16 @@
         <w:tblStyle w:val="Table"/>
         <w:tblLook w:firstRow="0" w:lastRow="0" w:firstColumn="0" w:lastColumn="0" w:noHBand="0" w:noVBand="0" w:val="0000"/>
         <w:tblBorders>
+          <w:top w:val="single" w:sz="4" w:space="0" w:color="CC1914"/>
           <w:left w:val="single" w:sz="24" w:space="0" w:color="CC1914"/>
+          <w:bottom w:val="single" w:sz="4" w:space="0" w:color="CC1914"/>
           <w:right w:val="single" w:sz="4" w:space="0" w:color="CC1914"/>
-          <w:top w:val="single" w:sz="4" w:space="0" w:color="CC1914"/>
-          <w:bottom w:val="single" w:sz="4" w:space="0" w:color="CC1914"/>
         </w:tblBorders>
         <w:tblCellMar>
           <w:left w:w="144" w:type="dxa"/>
           <w:right w:w="144" w:type="dxa"/>
         </w:tblCellMar>
-        <w:tblInd w:w="164" w:type="dxa"/>
-        <w:tblW w:type="pct" w:w="100%"/>
+        <w:tblLook w:firstRow="0" w:lastRow="0" w:firstColumn="0" w:lastColumn="0" w:noHBand="0" w:noVBand="0" w:val="0000"/>
       </w:tblPr>
       <w:tr>
         <w:trPr>
@@ -4120,6 +4119,7 @@
               <w:t xml:space="preserve">All regrades will be assessed based only on the submitted work. You cannot get a higher grade by explanating what you meant (either in person or online) or by adding information or reasoning to what is submitted after the fact. The goal of the regrade is to draw attention to a potential grading problem, not to supplement the submission.</w:t>
             </w:r>
           </w:p>
+          <w:p/>
         </w:tc>
       </w:tr>
     </w:tbl>
@@ -4136,17 +4136,16 @@
         <w:tblStyle w:val="Table"/>
         <w:tblLook w:firstRow="0" w:lastRow="0" w:firstColumn="0" w:lastColumn="0" w:noHBand="0" w:noVBand="0" w:val="0000"/>
         <w:tblBorders>
+          <w:top w:val="single" w:sz="4" w:space="0" w:color="EB9113"/>
           <w:left w:val="single" w:sz="24" w:space="0" w:color="EB9113"/>
+          <w:bottom w:val="single" w:sz="4" w:space="0" w:color="EB9113"/>
           <w:right w:val="single" w:sz="4" w:space="0" w:color="EB9113"/>
-          <w:top w:val="single" w:sz="4" w:space="0" w:color="EB9113"/>
-          <w:bottom w:val="single" w:sz="4" w:space="0" w:color="EB9113"/>
         </w:tblBorders>
         <w:tblCellMar>
           <w:left w:w="144" w:type="dxa"/>
           <w:right w:w="144" w:type="dxa"/>
         </w:tblCellMar>
-        <w:tblInd w:w="164" w:type="dxa"/>
-        <w:tblW w:type="pct" w:w="100%"/>
+        <w:tblLook w:firstRow="0" w:lastRow="0" w:firstColumn="0" w:lastColumn="0" w:noHBand="0" w:noVBand="0" w:val="0000"/>
       </w:tblPr>
       <w:tr>
         <w:trPr>
@@ -4244,6 +4243,7 @@
               <w:t xml:space="preserve">While you should submit regrade requests for legitimate errors, using them for fishing expeditions can also result in lost points if the TA or Prof. Srikrishnan decide that your initial grade was too lenient or if additional errors are identified.</w:t>
             </w:r>
           </w:p>
+          <w:p/>
         </w:tc>
       </w:tr>
     </w:tbl>
@@ -4260,17 +4260,16 @@
         <w:tblStyle w:val="Table"/>
         <w:tblLook w:firstRow="0" w:lastRow="0" w:firstColumn="0" w:lastColumn="0" w:noHBand="0" w:noVBand="0" w:val="0000"/>
         <w:tblBorders>
+          <w:top w:val="single" w:sz="4" w:space="0" w:color="00A047"/>
           <w:left w:val="single" w:sz="24" w:space="0" w:color="00A047"/>
+          <w:bottom w:val="single" w:sz="4" w:space="0" w:color="00A047"/>
           <w:right w:val="single" w:sz="4" w:space="0" w:color="00A047"/>
-          <w:top w:val="single" w:sz="4" w:space="0" w:color="00A047"/>
-          <w:bottom w:val="single" w:sz="4" w:space="0" w:color="00A047"/>
         </w:tblBorders>
         <w:tblCellMar>
           <w:left w:w="144" w:type="dxa"/>
           <w:right w:w="144" w:type="dxa"/>
         </w:tblCellMar>
-        <w:tblInd w:w="164" w:type="dxa"/>
-        <w:tblW w:type="pct" w:w="100%"/>
+        <w:tblLook w:firstRow="0" w:lastRow="0" w:firstColumn="0" w:lastColumn="0" w:noHBand="0" w:noVBand="0" w:val="0000"/>
       </w:tblPr>
       <w:tr>
         <w:trPr>
@@ -4422,6 +4421,7 @@
               <w:t xml:space="preserve">.</w:t>
             </w:r>
           </w:p>
+          <w:p/>
         </w:tc>
       </w:tr>
     </w:tbl>

</xml_diff>

<commit_message>
add lecture 12-3 and hw4 solutions
</commit_message>
<xml_diff>
--- a/_site/syllabus-BEE4850-SP26.docx
+++ b/_site/syllabus-BEE4850-SP26.docx
@@ -473,16 +473,17 @@
         <w:tblStyle w:val="Table"/>
         <w:tblLook w:firstRow="0" w:lastRow="0" w:firstColumn="0" w:lastColumn="0" w:noHBand="0" w:noVBand="0" w:val="0000"/>
         <w:tblBorders>
+          <w:left w:val="single" w:sz="24" w:space="0" w:color="00A047"/>
+          <w:right w:val="single" w:sz="4" w:space="0" w:color="00A047"/>
           <w:top w:val="single" w:sz="4" w:space="0" w:color="00A047"/>
-          <w:left w:val="single" w:sz="24" w:space="0" w:color="00A047"/>
           <w:bottom w:val="single" w:sz="4" w:space="0" w:color="00A047"/>
-          <w:right w:val="single" w:sz="4" w:space="0" w:color="00A047"/>
         </w:tblBorders>
         <w:tblCellMar>
           <w:left w:w="144" w:type="dxa"/>
           <w:right w:w="144" w:type="dxa"/>
         </w:tblCellMar>
-        <w:tblLook w:firstRow="0" w:lastRow="0" w:firstColumn="0" w:lastColumn="0" w:noHBand="0" w:noVBand="0" w:val="0000"/>
+        <w:tblInd w:w="164" w:type="dxa"/>
+        <w:tblW w:type="pct" w:w="100%"/>
       </w:tblPr>
       <w:tr>
         <w:trPr>
@@ -580,7 +581,6 @@
               <w:t xml:space="preserve">If your programming or statistics skills are a little rusty, don’t worry! We will review concepts and build skills as needed.</w:t>
             </w:r>
           </w:p>
-          <w:p/>
         </w:tc>
       </w:tr>
     </w:tbl>
@@ -1148,16 +1148,17 @@
         <w:tblStyle w:val="Table"/>
         <w:tblLook w:firstRow="0" w:lastRow="0" w:firstColumn="0" w:lastColumn="0" w:noHBand="0" w:noVBand="0" w:val="0000"/>
         <w:tblBorders>
+          <w:left w:val="single" w:sz="24" w:space="0" w:color="CC1914"/>
+          <w:right w:val="single" w:sz="4" w:space="0" w:color="CC1914"/>
           <w:top w:val="single" w:sz="4" w:space="0" w:color="CC1914"/>
-          <w:left w:val="single" w:sz="24" w:space="0" w:color="CC1914"/>
           <w:bottom w:val="single" w:sz="4" w:space="0" w:color="CC1914"/>
-          <w:right w:val="single" w:sz="4" w:space="0" w:color="CC1914"/>
         </w:tblBorders>
         <w:tblCellMar>
           <w:left w:w="144" w:type="dxa"/>
           <w:right w:w="144" w:type="dxa"/>
         </w:tblCellMar>
-        <w:tblLook w:firstRow="0" w:lastRow="0" w:firstColumn="0" w:lastColumn="0" w:noHBand="0" w:noVBand="0" w:val="0000"/>
+        <w:tblInd w:w="164" w:type="dxa"/>
+        <w:tblW w:type="pct" w:w="100%"/>
       </w:tblPr>
       <w:tr>
         <w:trPr>
@@ -1255,7 +1256,6 @@
               <w:t xml:space="preserve">We all make mistakes in our communications with one another, both when speaking and listening. Be mindful of how spoken or written language might be misunderstood, and be aware that, for a variety of reasons, how others perceive your words and actions may not be exactly how you intended them. At the same time, it is also essential that we be respectful and interpret each other’s comments and actions in good faith.</w:t>
             </w:r>
           </w:p>
-          <w:p/>
         </w:tc>
       </w:tr>
     </w:tbl>
@@ -1347,16 +1347,17 @@
         <w:tblStyle w:val="Table"/>
         <w:tblLook w:firstRow="0" w:lastRow="0" w:firstColumn="0" w:lastColumn="0" w:noHBand="0" w:noVBand="0" w:val="0000"/>
         <w:tblBorders>
+          <w:left w:val="single" w:sz="24" w:space="0" w:color="CC1914"/>
+          <w:right w:val="single" w:sz="4" w:space="0" w:color="CC1914"/>
           <w:top w:val="single" w:sz="4" w:space="0" w:color="CC1914"/>
-          <w:left w:val="single" w:sz="24" w:space="0" w:color="CC1914"/>
           <w:bottom w:val="single" w:sz="4" w:space="0" w:color="CC1914"/>
-          <w:right w:val="single" w:sz="4" w:space="0" w:color="CC1914"/>
         </w:tblBorders>
         <w:tblCellMar>
           <w:left w:w="144" w:type="dxa"/>
           <w:right w:w="144" w:type="dxa"/>
         </w:tblCellMar>
-        <w:tblLook w:firstRow="0" w:lastRow="0" w:firstColumn="0" w:lastColumn="0" w:noHBand="0" w:noVBand="0" w:val="0000"/>
+        <w:tblInd w:w="164" w:type="dxa"/>
+        <w:tblW w:type="pct" w:w="100%"/>
       </w:tblPr>
       <w:tr>
         <w:trPr>
@@ -1499,7 +1500,6 @@
               <w:t xml:space="preserve">If you see unanswered questions and you have some insight, please answer! This class will work best when we all work together as a community.</w:t>
             </w:r>
           </w:p>
-          <w:p/>
         </w:tc>
       </w:tr>
     </w:tbl>
@@ -1540,16 +1540,17 @@
         <w:tblStyle w:val="Table"/>
         <w:tblLook w:firstRow="0" w:lastRow="0" w:firstColumn="0" w:lastColumn="0" w:noHBand="0" w:noVBand="0" w:val="0000"/>
         <w:tblBorders>
+          <w:left w:val="single" w:sz="24" w:space="0" w:color="CC1914"/>
+          <w:right w:val="single" w:sz="4" w:space="0" w:color="CC1914"/>
           <w:top w:val="single" w:sz="4" w:space="0" w:color="CC1914"/>
-          <w:left w:val="single" w:sz="24" w:space="0" w:color="CC1914"/>
           <w:bottom w:val="single" w:sz="4" w:space="0" w:color="CC1914"/>
-          <w:right w:val="single" w:sz="4" w:space="0" w:color="CC1914"/>
         </w:tblBorders>
         <w:tblCellMar>
           <w:left w:w="144" w:type="dxa"/>
           <w:right w:w="144" w:type="dxa"/>
         </w:tblCellMar>
-        <w:tblLook w:firstRow="0" w:lastRow="0" w:firstColumn="0" w:lastColumn="0" w:noHBand="0" w:noVBand="0" w:val="0000"/>
+        <w:tblInd w:w="164" w:type="dxa"/>
+        <w:tblW w:type="pct" w:w="100%"/>
       </w:tblPr>
       <w:tr>
         <w:trPr>
@@ -1647,7 +1648,6 @@
               <w:t xml:space="preserve">I am not a trained counselor, but I am here to support you in whatever capacity we can. You should never feel that you need to push yourself past your limits to complete any assignment for this class or any other. If we need to make modifications to the course or assignment schedule, you can certainly reach out to me, and all relevant discussions will be kept strictly confidential.</w:t>
             </w:r>
           </w:p>
-          <w:p/>
         </w:tc>
       </w:tr>
     </w:tbl>
@@ -1705,16 +1705,17 @@
         <w:tblStyle w:val="Table"/>
         <w:tblLook w:firstRow="0" w:lastRow="0" w:firstColumn="0" w:lastColumn="0" w:noHBand="0" w:noVBand="0" w:val="0000"/>
         <w:tblBorders>
+          <w:left w:val="single" w:sz="24" w:space="0" w:color="CC1914"/>
+          <w:right w:val="single" w:sz="4" w:space="0" w:color="CC1914"/>
           <w:top w:val="single" w:sz="4" w:space="0" w:color="CC1914"/>
-          <w:left w:val="single" w:sz="24" w:space="0" w:color="CC1914"/>
           <w:bottom w:val="single" w:sz="4" w:space="0" w:color="CC1914"/>
-          <w:right w:val="single" w:sz="4" w:space="0" w:color="CC1914"/>
         </w:tblBorders>
         <w:tblCellMar>
           <w:left w:w="144" w:type="dxa"/>
           <w:right w:w="144" w:type="dxa"/>
         </w:tblCellMar>
-        <w:tblLook w:firstRow="0" w:lastRow="0" w:firstColumn="0" w:lastColumn="0" w:noHBand="0" w:noVBand="0" w:val="0000"/>
+        <w:tblInd w:w="164" w:type="dxa"/>
+        <w:tblW w:type="pct" w:w="100%"/>
       </w:tblPr>
       <w:tr>
         <w:trPr>
@@ -1812,7 +1813,6 @@
               <w:t xml:space="preserve">Please stay home if you’re feeling sick! This is beneficial for both for your own recovery and the health and safety of your classmates. We will also make any necessary arrangements for you to stay on top of the class material and if whatever is going on will negatively impact your grade, for example by causing you to be unable to submit an assignment on time.</w:t>
             </w:r>
           </w:p>
-          <w:p/>
         </w:tc>
       </w:tr>
     </w:tbl>
@@ -1850,16 +1850,17 @@
         <w:tblStyle w:val="Table"/>
         <w:tblLook w:firstRow="0" w:lastRow="0" w:firstColumn="0" w:lastColumn="0" w:noHBand="0" w:noVBand="0" w:val="0000"/>
         <w:tblBorders>
+          <w:left w:val="single" w:sz="24" w:space="0" w:color="CC1914"/>
+          <w:right w:val="single" w:sz="4" w:space="0" w:color="CC1914"/>
           <w:top w:val="single" w:sz="4" w:space="0" w:color="CC1914"/>
-          <w:left w:val="single" w:sz="24" w:space="0" w:color="CC1914"/>
           <w:bottom w:val="single" w:sz="4" w:space="0" w:color="CC1914"/>
-          <w:right w:val="single" w:sz="4" w:space="0" w:color="CC1914"/>
         </w:tblBorders>
         <w:tblCellMar>
           <w:left w:w="144" w:type="dxa"/>
           <w:right w:w="144" w:type="dxa"/>
         </w:tblCellMar>
-        <w:tblLook w:firstRow="0" w:lastRow="0" w:firstColumn="0" w:lastColumn="0" w:noHBand="0" w:noVBand="0" w:val="0000"/>
+        <w:tblInd w:w="164" w:type="dxa"/>
+        <w:tblW w:type="pct" w:w="100%"/>
       </w:tblPr>
       <w:tr>
         <w:trPr>
@@ -1964,7 +1965,6 @@
               <w:t xml:space="preserve">: Don’t cheat, copy, or plagiarize!</w:t>
             </w:r>
           </w:p>
-          <w:p/>
         </w:tc>
       </w:tr>
     </w:tbl>
@@ -2049,16 +2049,17 @@
         <w:tblStyle w:val="Table"/>
         <w:tblLook w:firstRow="0" w:lastRow="0" w:firstColumn="0" w:lastColumn="0" w:noHBand="0" w:noVBand="0" w:val="0000"/>
         <w:tblBorders>
+          <w:left w:val="single" w:sz="24" w:space="0" w:color="00A047"/>
+          <w:right w:val="single" w:sz="4" w:space="0" w:color="00A047"/>
           <w:top w:val="single" w:sz="4" w:space="0" w:color="00A047"/>
-          <w:left w:val="single" w:sz="24" w:space="0" w:color="00A047"/>
           <w:bottom w:val="single" w:sz="4" w:space="0" w:color="00A047"/>
-          <w:right w:val="single" w:sz="4" w:space="0" w:color="00A047"/>
         </w:tblBorders>
         <w:tblCellMar>
           <w:left w:w="144" w:type="dxa"/>
           <w:right w:w="144" w:type="dxa"/>
         </w:tblCellMar>
-        <w:tblLook w:firstRow="0" w:lastRow="0" w:firstColumn="0" w:lastColumn="0" w:noHBand="0" w:noVBand="0" w:val="0000"/>
+        <w:tblInd w:w="164" w:type="dxa"/>
+        <w:tblW w:type="pct" w:w="100%"/>
       </w:tblPr>
       <w:tr>
         <w:trPr>
@@ -2185,7 +2186,6 @@
               <w:t xml:space="preserve">.</w:t>
             </w:r>
           </w:p>
-          <w:p/>
         </w:tc>
       </w:tr>
     </w:tbl>
@@ -2273,16 +2273,17 @@
         <w:tblStyle w:val="Table"/>
         <w:tblLook w:firstRow="0" w:lastRow="0" w:firstColumn="0" w:lastColumn="0" w:noHBand="0" w:noVBand="0" w:val="0000"/>
         <w:tblBorders>
+          <w:left w:val="single" w:sz="24" w:space="0" w:color="EB9113"/>
+          <w:right w:val="single" w:sz="4" w:space="0" w:color="EB9113"/>
           <w:top w:val="single" w:sz="4" w:space="0" w:color="EB9113"/>
-          <w:left w:val="single" w:sz="24" w:space="0" w:color="EB9113"/>
           <w:bottom w:val="single" w:sz="4" w:space="0" w:color="EB9113"/>
-          <w:right w:val="single" w:sz="4" w:space="0" w:color="EB9113"/>
         </w:tblBorders>
         <w:tblCellMar>
           <w:left w:w="144" w:type="dxa"/>
           <w:right w:w="144" w:type="dxa"/>
         </w:tblCellMar>
-        <w:tblLook w:firstRow="0" w:lastRow="0" w:firstColumn="0" w:lastColumn="0" w:noHBand="0" w:noVBand="0" w:val="0000"/>
+        <w:tblInd w:w="164" w:type="dxa"/>
+        <w:tblW w:type="pct" w:w="100%"/>
       </w:tblPr>
       <w:tr>
         <w:trPr>
@@ -2391,7 +2392,6 @@
               <w:t xml:space="preserve">This is fundamentally different from working with your classmates, who are also trying out the problems for the first time.</w:t>
             </w:r>
           </w:p>
-          <w:p/>
         </w:tc>
       </w:tr>
     </w:tbl>
@@ -2711,16 +2711,17 @@
         <w:tblStyle w:val="Table"/>
         <w:tblLook w:firstRow="0" w:lastRow="0" w:firstColumn="0" w:lastColumn="0" w:noHBand="0" w:noVBand="0" w:val="0000"/>
         <w:tblBorders>
+          <w:left w:val="single" w:sz="24" w:space="0" w:color="00A047"/>
+          <w:right w:val="single" w:sz="4" w:space="0" w:color="00A047"/>
           <w:top w:val="single" w:sz="4" w:space="0" w:color="00A047"/>
-          <w:left w:val="single" w:sz="24" w:space="0" w:color="00A047"/>
           <w:bottom w:val="single" w:sz="4" w:space="0" w:color="00A047"/>
-          <w:right w:val="single" w:sz="4" w:space="0" w:color="00A047"/>
         </w:tblBorders>
         <w:tblCellMar>
           <w:left w:w="144" w:type="dxa"/>
           <w:right w:w="144" w:type="dxa"/>
         </w:tblCellMar>
-        <w:tblLook w:firstRow="0" w:lastRow="0" w:firstColumn="0" w:lastColumn="0" w:noHBand="0" w:noVBand="0" w:val="0000"/>
+        <w:tblInd w:w="164" w:type="dxa"/>
+        <w:tblW w:type="pct" w:w="100%"/>
       </w:tblPr>
       <w:tr>
         <w:trPr>
@@ -2867,7 +2868,6 @@
               <w:t xml:space="preserve">if you have a question about a homework due on Thursday and send a request on the immediately prior Wednesday; schedules for course staff may already be full). We recommend starting your homework promptly so you can take advantage of office hours or make an appointment over a longer period.</w:t>
             </w:r>
           </w:p>
-          <w:p/>
         </w:tc>
       </w:tr>
     </w:tbl>
@@ -4012,16 +4012,17 @@
         <w:tblStyle w:val="Table"/>
         <w:tblLook w:firstRow="0" w:lastRow="0" w:firstColumn="0" w:lastColumn="0" w:noHBand="0" w:noVBand="0" w:val="0000"/>
         <w:tblBorders>
+          <w:left w:val="single" w:sz="24" w:space="0" w:color="CC1914"/>
+          <w:right w:val="single" w:sz="4" w:space="0" w:color="CC1914"/>
           <w:top w:val="single" w:sz="4" w:space="0" w:color="CC1914"/>
-          <w:left w:val="single" w:sz="24" w:space="0" w:color="CC1914"/>
           <w:bottom w:val="single" w:sz="4" w:space="0" w:color="CC1914"/>
-          <w:right w:val="single" w:sz="4" w:space="0" w:color="CC1914"/>
         </w:tblBorders>
         <w:tblCellMar>
           <w:left w:w="144" w:type="dxa"/>
           <w:right w:w="144" w:type="dxa"/>
         </w:tblCellMar>
-        <w:tblLook w:firstRow="0" w:lastRow="0" w:firstColumn="0" w:lastColumn="0" w:noHBand="0" w:noVBand="0" w:val="0000"/>
+        <w:tblInd w:w="164" w:type="dxa"/>
+        <w:tblW w:type="pct" w:w="100%"/>
       </w:tblPr>
       <w:tr>
         <w:trPr>
@@ -4119,7 +4120,6 @@
               <w:t xml:space="preserve">All regrades will be assessed based only on the submitted work. You cannot get a higher grade by explanating what you meant (either in person or online) or by adding information or reasoning to what is submitted after the fact. The goal of the regrade is to draw attention to a potential grading problem, not to supplement the submission.</w:t>
             </w:r>
           </w:p>
-          <w:p/>
         </w:tc>
       </w:tr>
     </w:tbl>
@@ -4136,16 +4136,17 @@
         <w:tblStyle w:val="Table"/>
         <w:tblLook w:firstRow="0" w:lastRow="0" w:firstColumn="0" w:lastColumn="0" w:noHBand="0" w:noVBand="0" w:val="0000"/>
         <w:tblBorders>
+          <w:left w:val="single" w:sz="24" w:space="0" w:color="EB9113"/>
+          <w:right w:val="single" w:sz="4" w:space="0" w:color="EB9113"/>
           <w:top w:val="single" w:sz="4" w:space="0" w:color="EB9113"/>
-          <w:left w:val="single" w:sz="24" w:space="0" w:color="EB9113"/>
           <w:bottom w:val="single" w:sz="4" w:space="0" w:color="EB9113"/>
-          <w:right w:val="single" w:sz="4" w:space="0" w:color="EB9113"/>
         </w:tblBorders>
         <w:tblCellMar>
           <w:left w:w="144" w:type="dxa"/>
           <w:right w:w="144" w:type="dxa"/>
         </w:tblCellMar>
-        <w:tblLook w:firstRow="0" w:lastRow="0" w:firstColumn="0" w:lastColumn="0" w:noHBand="0" w:noVBand="0" w:val="0000"/>
+        <w:tblInd w:w="164" w:type="dxa"/>
+        <w:tblW w:type="pct" w:w="100%"/>
       </w:tblPr>
       <w:tr>
         <w:trPr>
@@ -4243,7 +4244,6 @@
               <w:t xml:space="preserve">While you should submit regrade requests for legitimate errors, using them for fishing expeditions can also result in lost points if the TA or Prof. Srikrishnan decide that your initial grade was too lenient or if additional errors are identified.</w:t>
             </w:r>
           </w:p>
-          <w:p/>
         </w:tc>
       </w:tr>
     </w:tbl>
@@ -4260,16 +4260,17 @@
         <w:tblStyle w:val="Table"/>
         <w:tblLook w:firstRow="0" w:lastRow="0" w:firstColumn="0" w:lastColumn="0" w:noHBand="0" w:noVBand="0" w:val="0000"/>
         <w:tblBorders>
+          <w:left w:val="single" w:sz="24" w:space="0" w:color="00A047"/>
+          <w:right w:val="single" w:sz="4" w:space="0" w:color="00A047"/>
           <w:top w:val="single" w:sz="4" w:space="0" w:color="00A047"/>
-          <w:left w:val="single" w:sz="24" w:space="0" w:color="00A047"/>
           <w:bottom w:val="single" w:sz="4" w:space="0" w:color="00A047"/>
-          <w:right w:val="single" w:sz="4" w:space="0" w:color="00A047"/>
         </w:tblBorders>
         <w:tblCellMar>
           <w:left w:w="144" w:type="dxa"/>
           <w:right w:w="144" w:type="dxa"/>
         </w:tblCellMar>
-        <w:tblLook w:firstRow="0" w:lastRow="0" w:firstColumn="0" w:lastColumn="0" w:noHBand="0" w:noVBand="0" w:val="0000"/>
+        <w:tblInd w:w="164" w:type="dxa"/>
+        <w:tblW w:type="pct" w:w="100%"/>
       </w:tblPr>
       <w:tr>
         <w:trPr>
@@ -4421,7 +4422,6 @@
               <w:t xml:space="preserve">.</w:t>
             </w:r>
           </w:p>
-          <w:p/>
         </w:tc>
       </w:tr>
     </w:tbl>

</xml_diff>